<commit_message>
Publish concrete development case and interactive multilingual portfolio
</commit_message>
<xml_diff>
--- a/assets/resumes/yo-tenra-en-experience.docx
+++ b/assets/resumes/yo-tenra-en-experience.docx
@@ -19,7 +19,7 @@
         <w:rPr>
           <w:b/>
         </w:rPr>
-        <w:t>AI-assisted software development · Data quality · Business operations</w:t>
+        <w:t>AI-assisted software development · Data quality · Business requirements and product work</w:t>
       </w:r>
     </w:p>
     <w:p>
@@ -29,7 +29,7 @@
             <w:rStyle w:val="Hyperlink"/>
             <w:color w:val="333333"/>
           </w:rPr>
-          <w:t>1@yotenra.com</w:t>
+          <w:t>Portfolio</w:t>
         </w:r>
       </w:hyperlink>
       <w:r>
@@ -42,7 +42,7 @@
             <w:rStyle w:val="Hyperlink"/>
             <w:color w:val="333333"/>
           </w:rPr>
-          <w:t>Portfolio</w:t>
+          <w:t>GitHub</w:t>
         </w:r>
       </w:hyperlink>
       <w:r>
@@ -50,19 +50,6 @@
         <w:t xml:space="preserve"> · </w:t>
       </w:r>
       <w:hyperlink r:id="rId11">
-        <w:r>
-          <w:rPr>
-            <w:rStyle w:val="Hyperlink"/>
-            <w:color w:val="333333"/>
-          </w:rPr>
-          <w:t>GitHub</w:t>
-        </w:r>
-      </w:hyperlink>
-      <w:r>
-        <w:rPr/>
-        <w:t xml:space="preserve"> · </w:t>
-      </w:r>
-      <w:hyperlink r:id="rId12">
         <w:r>
           <w:rPr>
             <w:rStyle w:val="Hyperlink"/>
@@ -84,7 +71,7 @@
     <w:p>
       <w:r>
         <w:rPr/>
-        <w:t>Master's student in Social Informatics at Kansai University, with experience in business requirements, customer-facing operations, and data quality. Build research and everyday tools with AI assistance, starting with a practical need and refining the result through use and validation. Seeking opportunities in AI applications, prototyping, and business tools during my studies or after graduation; start date by agreement.</w:t>
+        <w:t>Master's student in Social Informatics at Kansai University, expected to graduate in September 2027. Experience in business requirements, development coordination, customer-facing operations, and company data quality. Develop research and business tools with AI assistance, focusing on requirements, business fit, verification, and continued improvement. Seeking roles in AI applications, product prototyping, and business tools. Preferred start date: October 2027; April 2028 is also possible.</w:t>
       </w:r>
     </w:p>
     <w:p>
@@ -113,7 +100,7 @@
         <w:rPr>
           <w:b/>
         </w:rPr>
-        <w:t>Apr 2026–Present · Part-time</w:t>
+        <w:t>2026–Present · Part-time</w:t>
       </w:r>
     </w:p>
     <w:p>
@@ -122,7 +109,7 @@
       </w:pPr>
       <w:r>
         <w:rPr/>
-        <w:t>Investigate missing or incorrect company data using source pages, logs, and samples, working with engineers and AI tools to trace issues through the extraction workflow.</w:t>
+        <w:t>Work on company information extraction and data quality, directly handling production data in S3 that is delivered to clients and modifying the production pipeline. Authored 190 PRs that were merged after colleague review over three months, about 320 working hours.</w:t>
       </w:r>
     </w:p>
     <w:p>
@@ -131,7 +118,7 @@
       </w:pPr>
       <w:r>
         <w:rPr/>
-        <w:t>Compare proposed fixes against source evidence and counterexamples, checking both the intended improvement and possible effects on valid data.</w:t>
+        <w:t>Build reusable transformations for recurring data errors and submit corresponding fixes to the production pipeline to reduce recurrence. Personally execute production corrections after dry runs and backups, then check the results. Resolved 38 tasks in the final month and a half of that period, about 180 hours.</w:t>
       </w:r>
     </w:p>
     <w:p>
@@ -140,7 +127,7 @@
       </w:pPr>
       <w:r>
         <w:rPr/>
-        <w:t>Help prepare historical-data corrections, coordinate execution with authorised colleagues, and check results and outstanding issues.</w:t>
+        <w:t>Define problems and goals, assess Claude's investigations and implementation proposals for business fit and risk, and record acceptance criteria, verification results, and work logs. Built a database-backed workspace for personal use so subsequent AI sessions can continue from recorded findings and next steps.</w:t>
       </w:r>
     </w:p>
     <w:p>
@@ -149,7 +136,7 @@
       </w:pPr>
       <w:r>
         <w:rPr/>
-        <w:t>Develop and use a personal work tracker with AI assistance, retaining task history, next steps, and source references so later AI sessions can continue from earlier work.</w:t>
+        <w:t>During this work, accuracy for one data field rose from over 40% to 85%, and its coverage rose from over 30% to 75% (my work records, October 2026).</w:t>
       </w:r>
     </w:p>
     <w:p>
@@ -245,7 +232,7 @@
       </w:pPr>
       <w:r>
         <w:rPr/>
-        <w:t>Produced videos and guides explaining game events, costs, and potential returns to help customers compare options; documented service procedures and organised customer-support responsibilities and follow-up.</w:t>
+        <w:t>Produced videos and guides explaining game events, costs, and potential returns to help customers compare options; documented service procedures and organized customer-support responsibilities and follow-up.</w:t>
       </w:r>
     </w:p>
     <w:p>
@@ -293,7 +280,7 @@
       </w:pPr>
       <w:r>
         <w:rPr/>
-        <w:t>Selected Projects</w:t>
+        <w:t>Selected projects</w:t>
       </w:r>
     </w:p>
     <w:p>
@@ -302,7 +289,7 @@
       </w:pPr>
       <w:r>
         <w:rPr/>
-        <w:t>CorpLink-AI — News Data Preparation Tool</w:t>
+        <w:t>CorpLink-AI — News data preparation tool</w:t>
       </w:r>
     </w:p>
     <w:p>
@@ -315,7 +302,7 @@
         </w:rPr>
         <w:t xml:space="preserve">Feb–Mar 2026 · </w:t>
       </w:r>
-      <w:hyperlink r:id="rId13">
+      <w:hyperlink r:id="rId12">
         <w:r>
           <w:rPr>
             <w:rStyle w:val="Hyperlink"/>
@@ -346,11 +333,20 @@
     </w:p>
     <w:p>
       <w:pPr>
+        <w:pStyle w:val="ListBullet"/>
+      </w:pPr>
+      <w:r>
+        <w:rPr/>
+        <w:t>Took responsibility from requirements through deployment, consulting Gemini and ChatGPT for code proposals and integrating and deploying the result myself.</w:t>
+      </w:r>
+    </w:p>
+    <w:p>
+      <w:pPr>
         <w:pStyle w:val="Heading2"/>
       </w:pPr>
       <w:r>
         <w:rPr/>
-        <w:t>Open-Source Software Dependency Analysis — Master's Research</w:t>
+        <w:t>Open-source software dependency analysis — Master's research</w:t>
       </w:r>
     </w:p>
     <w:p>
@@ -363,7 +359,7 @@
         </w:rPr>
         <w:t xml:space="preserve">Ongoing · </w:t>
       </w:r>
-      <w:hyperlink r:id="rId14">
+      <w:hyperlink r:id="rId13">
         <w:r>
           <w:rPr>
             <w:rStyle w:val="Hyperlink"/>
@@ -399,7 +395,52 @@
       </w:pPr>
       <w:r>
         <w:rPr/>
-        <w:t>Tools for Everyday Use</w:t>
+        <w:t>Apps for everyday use</w:t>
+      </w:r>
+    </w:p>
+    <w:p>
+      <w:pPr>
+        <w:pStyle w:val="ListBullet"/>
+      </w:pPr>
+      <w:r>
+        <w:rPr>
+          <w:b/>
+        </w:rPr>
+        <w:t>AWS Pass It:</w:t>
+      </w:r>
+      <w:r>
+        <w:rPr/>
+        <w:t xml:space="preserve"> Practice for seven AWS certifications, exam-specific question banks in Chinese, Japanese, and English, a three-language interface, mock exam score estimates, mistake review, glossary definitions, and questions that can be copied into an AI chat.</w:t>
+      </w:r>
+    </w:p>
+    <w:p>
+      <w:pPr>
+        <w:pStyle w:val="ListBullet"/>
+      </w:pPr>
+      <w:r>
+        <w:rPr>
+          <w:b/>
+        </w:rPr>
+        <w:t>CalTracker:</w:t>
+      </w:r>
+      <w:r>
+        <w:rPr/>
+        <w:t xml:space="preserve"> Estimate energy expenditure from recent intake and weight changes, calculate a daily intake target, and record body measurements.</w:t>
+      </w:r>
+    </w:p>
+    <w:p>
+      <w:pPr>
+        <w:pStyle w:val="ListBullet"/>
+      </w:pPr>
+      <w:r>
+        <w:rPr>
+          <w:b/>
+        </w:rPr>
+        <w:t>OOTD:</w:t>
+      </w:r>
+      <w:r>
+        <w:rPr/>
+        <w:t xml:space="preserve"> Connect clothing, storage compartments, wear history, and outfits to show cost per wear and unworn items.</w:t>
       </w:r>
     </w:p>
     <w:p>
@@ -408,37 +449,7 @@
       </w:pPr>
       <w:r>
         <w:rPr/>
-        <w:t xml:space="preserve">Build and refine personal applications with AI assistance: </w:t>
-      </w:r>
-      <w:r>
-        <w:rPr>
-          <w:b/>
-        </w:rPr>
-        <w:t>OOTD</w:t>
-      </w:r>
-      <w:r>
-        <w:rPr/>
-        <w:t xml:space="preserve"> connects clothing, orders, outfits, and wear history; </w:t>
-      </w:r>
-      <w:r>
-        <w:rPr>
-          <w:b/>
-        </w:rPr>
-        <w:t>CalTracker</w:t>
-      </w:r>
-      <w:r>
-        <w:rPr/>
-        <w:t xml:space="preserve"> brings an existing spreadsheet routine into a food and weight log; </w:t>
-      </w:r>
-      <w:r>
-        <w:rPr>
-          <w:b/>
-        </w:rPr>
-        <w:t>AWS Pass It</w:t>
-      </w:r>
-      <w:r>
-        <w:rPr/>
-        <w:t xml:space="preserve"> combines Chinese, Japanese, and English explanations with review of missed questions.</w:t>
+        <w:t>Develop these apps from personal needs with AI assistance; use and refine them regularly.</w:t>
       </w:r>
     </w:p>
     <w:p>
@@ -510,7 +521,7 @@
       </w:pPr>
       <w:r>
         <w:rPr/>
-        <w:t>Tools, Qualifications, and Languages</w:t>
+        <w:t>Tools, qualifications, and languages</w:t>
       </w:r>
     </w:p>
     <w:p>
@@ -522,7 +533,7 @@
       </w:r>
       <w:r>
         <w:rPr/>
-        <w:t xml:space="preserve"> Experience using Python, SQL, Git, and data-processing tools in AI-assisted development. Read and make focused changes to code; use AI extensively for implementation, while defining requirements, assessing business fit, and organising validation.</w:t>
+        <w:t xml:space="preserve"> Experience using Python, SQL, Git, and data-processing tools in AI-assisted development. Read parts of the code and make focused changes. AI assists much of the implementation; responsibilities include defining requirements, comparing approaches, assessing business fit and risk, organizing verification, and iterating.</w:t>
       </w:r>
     </w:p>
     <w:p>
@@ -534,7 +545,7 @@
       </w:r>
       <w:r>
         <w:rPr/>
-        <w:t xml:space="preserve"> Fundamental Information Technology Engineer Examination (Japan), passed May 2024; JLPT N1, Dec 2023; TOEIC Listening &amp; Reading 805, Aug 2022; BEC Higher, Grade C, May 2018.</w:t>
+        <w:t xml:space="preserve"> AWS Certified AI Practitioner, 2026; AWS Certified Cloud Practitioner, 2026; AWS Certified Solutions Architect – Associate, 2026; Fundamental Information Technology Engineer Examination (Japan), passed May 2024; JLPT N1, Dec 2023; TOEIC Listening &amp; Reading 805, Aug 2022; BEC Higher, Grade C, May 2018.</w:t>
       </w:r>
     </w:p>
     <w:p>
@@ -549,8 +560,32 @@
         <w:t xml:space="preserve"> Mandarin Chinese and Cantonese.</w:t>
       </w:r>
     </w:p>
+    <w:p>
+      <w:hyperlink r:id="rId14">
+        <w:r>
+          <w:rPr>
+            <w:rStyle w:val="Hyperlink"/>
+            <w:color w:val="333333"/>
+          </w:rPr>
+          <w:t>My toughest development project</w:t>
+        </w:r>
+      </w:hyperlink>
+      <w:r>
+        <w:rPr/>
+        <w:t xml:space="preserve"> · </w:t>
+      </w:r>
+      <w:hyperlink r:id="rId15">
+        <w:r>
+          <w:rPr>
+            <w:rStyle w:val="Hyperlink"/>
+            <w:color w:val="333333"/>
+          </w:rPr>
+          <w:t>Project features and interactive demos</w:t>
+        </w:r>
+      </w:hyperlink>
+    </w:p>
     <w:sectPr>
-      <w:footerReference w:type="default" r:id="rId15"/>
+      <w:footerReference w:type="default" r:id="rId16"/>
       <w:pgSz w:w="12240" w:h="15840"/>
       <w:pgMar w:top="922" w:right="1080" w:bottom="922" w:left="1080" w:header="720" w:footer="510" w:gutter="0"/>
       <w:cols w:space="720"/>
@@ -570,7 +605,7 @@
     <w:r>
       <w:rPr>
         <w:rFonts w:ascii="Times New Roman" w:hAnsi="Times New Roman" w:eastAsia="Noto Serif CJK JP" w:cs="Times New Roman"/>
-        <w:color w:val="191919"/>
+        <w:color w:val="000000"/>
         <w:sz w:val="18"/>
       </w:rPr>
       <w:t xml:space="preserve">Yo Tenra  |  </w:t>
@@ -945,11 +980,11 @@
     <w:rsid w:val="00FC693F"/>
     <w:pPr>
       <w:widowControl/>
-      <w:spacing w:after="100" w:line="269" w:lineRule="auto"/>
+      <w:spacing w:after="60" w:line="259" w:lineRule="auto"/>
     </w:pPr>
     <w:rPr>
       <w:rFonts w:ascii="Times New Roman" w:hAnsi="Times New Roman" w:eastAsia="Noto Serif CJK JP" w:cs="Times New Roman"/>
-      <w:color w:val="191919"/>
+      <w:color w:val="000000"/>
       <w:sz w:val="22"/>
     </w:rPr>
   </w:style>
@@ -1008,14 +1043,14 @@
     <w:pPr>
       <w:keepNext/>
       <w:keepLines/>
-      <w:spacing w:before="220" w:after="100"/>
+      <w:spacing w:before="160" w:after="80"/>
       <w:outlineLvl w:val="0"/>
     </w:pPr>
     <w:rPr>
       <w:rFonts w:ascii="Times New Roman" w:hAnsi="Times New Roman" w:eastAsia="Noto Serif CJK JP" w:cs="Times New Roman"/>
       <w:b/>
       <w:bCs/>
-      <w:color w:val="191919"/>
+      <w:color w:val="000000"/>
       <w:sz w:val="27"/>
       <w:szCs w:val="28"/>
     </w:rPr>
@@ -1032,14 +1067,14 @@
     <w:pPr>
       <w:keepNext/>
       <w:keepLines/>
-      <w:spacing w:before="160" w:after="60"/>
+      <w:spacing w:before="120" w:after="60"/>
       <w:outlineLvl w:val="1"/>
     </w:pPr>
     <w:rPr>
       <w:rFonts w:ascii="Times New Roman" w:hAnsi="Times New Roman" w:eastAsia="Noto Serif CJK JP" w:cs="Times New Roman"/>
       <w:b/>
       <w:bCs/>
-      <w:color w:val="191919"/>
+      <w:color w:val="000000"/>
       <w:sz w:val="23"/>
       <w:szCs w:val="26"/>
     </w:rPr>
@@ -1302,7 +1337,7 @@
     <w:rPr>
       <w:rFonts w:ascii="Times New Roman" w:hAnsi="Times New Roman" w:eastAsia="Noto Serif CJK JP" w:cs="Times New Roman"/>
       <w:b/>
-      <w:color w:val="191919"/>
+      <w:color w:val="000000"/>
       <w:spacing w:val="5"/>
       <w:kern w:val="28"/>
       <w:sz w:val="50"/>
@@ -1341,7 +1376,7 @@
       <w:rFonts w:ascii="Times New Roman" w:hAnsi="Times New Roman" w:eastAsia="Noto Serif CJK JP" w:cs="Times New Roman"/>
       <w:i/>
       <w:iCs/>
-      <w:color w:val="191919"/>
+      <w:color w:val="000000"/>
       <w:spacing w:val="15"/>
       <w:sz w:val="22"/>
       <w:szCs w:val="24"/>
@@ -1479,13 +1514,13 @@
       <w:numPr>
         <w:numId w:val="1"/>
       </w:numPr>
-      <w:spacing w:after="80" w:line="269" w:lineRule="auto"/>
+      <w:spacing w:after="60" w:line="259" w:lineRule="auto"/>
       <w:ind w:left="227" w:hanging="170"/>
       <w:contextualSpacing/>
     </w:pPr>
     <w:rPr>
       <w:rFonts w:ascii="Times New Roman" w:hAnsi="Times New Roman" w:eastAsia="Noto Serif CJK JP" w:cs="Times New Roman"/>
-      <w:color w:val="191919"/>
+      <w:color w:val="000000"/>
       <w:sz w:val="22"/>
     </w:rPr>
   </w:style>

</xml_diff>

<commit_message>
Clarify portfolio reading flow, navigation, and resume links
</commit_message>
<xml_diff>
--- a/assets/resumes/yo-tenra-en-experience.docx
+++ b/assets/resumes/yo-tenra-en-experience.docx
@@ -27,7 +27,8 @@
         <w:r>
           <w:rPr>
             <w:rStyle w:val="Hyperlink"/>
-            <w:color w:val="333333"/>
+            <w:color w:val="0563C1"/>
+            <w:u w:val="single"/>
           </w:rPr>
           <w:t>Portfolio</w:t>
         </w:r>
@@ -40,7 +41,8 @@
         <w:r>
           <w:rPr>
             <w:rStyle w:val="Hyperlink"/>
-            <w:color w:val="333333"/>
+            <w:color w:val="0563C1"/>
+            <w:u w:val="single"/>
           </w:rPr>
           <w:t>GitHub</w:t>
         </w:r>
@@ -53,7 +55,8 @@
         <w:r>
           <w:rPr>
             <w:rStyle w:val="Hyperlink"/>
-            <w:color w:val="333333"/>
+            <w:color w:val="0563C1"/>
+            <w:u w:val="single"/>
           </w:rPr>
           <w:t>Wantedly</w:t>
         </w:r>
@@ -306,7 +309,8 @@
         <w:r>
           <w:rPr>
             <w:rStyle w:val="Hyperlink"/>
-            <w:color w:val="333333"/>
+            <w:color w:val="0563C1"/>
+            <w:u w:val="single"/>
             <w:b/>
           </w:rPr>
           <w:t>Source code</w:t>
@@ -363,7 +367,8 @@
         <w:r>
           <w:rPr>
             <w:rStyle w:val="Hyperlink"/>
-            <w:color w:val="333333"/>
+            <w:color w:val="0563C1"/>
+            <w:u w:val="single"/>
             <w:b/>
           </w:rPr>
           <w:t>Interactive demo</w:t>
@@ -537,6 +542,9 @@
       </w:r>
     </w:p>
     <w:p>
+      <w:pPr>
+        <w:keepLines/>
+      </w:pPr>
       <w:r>
         <w:rPr>
           <w:b/>
@@ -545,7 +553,28 @@
       </w:r>
       <w:r>
         <w:rPr/>
-        <w:t xml:space="preserve"> AWS Certified AI Practitioner, 2026; AWS Certified Cloud Practitioner, 2026; AWS Certified Solutions Architect – Associate, 2026; Fundamental Information Technology Engineer Examination (Japan), passed May 2024; JLPT N1, Dec 2023; TOEIC Listening &amp; Reading 805, Aug 2022; BEC Higher, Grade C, May 2018.</w:t>
+        <w:t xml:space="preserve"> AWS Certified AI Practitioner, 2026;</w:t>
+      </w:r>
+      <w:r>
+        <w:br/>
+      </w:r>
+      <w:r>
+        <w:rPr/>
+        <w:t>AWS Certified Cloud Practitioner, 2026;</w:t>
+      </w:r>
+      <w:r>
+        <w:br/>
+      </w:r>
+      <w:r>
+        <w:rPr/>
+        <w:t>AWS Certified Solutions Architect – Associate, 2026;</w:t>
+      </w:r>
+      <w:r>
+        <w:br/>
+      </w:r>
+      <w:r>
+        <w:rPr/>
+        <w:t>Fundamental Information Technology Engineer Examination (Japan), passed May 2024; JLPT N1, Dec 2023; TOEIC Listening &amp; Reading 805, Aug 2022; BEC Higher, Grade C, May 2018.</w:t>
       </w:r>
     </w:p>
     <w:p>
@@ -565,7 +594,8 @@
         <w:r>
           <w:rPr>
             <w:rStyle w:val="Hyperlink"/>
-            <w:color w:val="333333"/>
+            <w:color w:val="0563C1"/>
+            <w:u w:val="single"/>
           </w:rPr>
           <w:t>My toughest development project</w:t>
         </w:r>
@@ -578,7 +608,8 @@
         <w:r>
           <w:rPr>
             <w:rStyle w:val="Hyperlink"/>
-            <w:color w:val="333333"/>
+            <w:color w:val="0563C1"/>
+            <w:u w:val="single"/>
           </w:rPr>
           <w:t>Project features and interactive demos</w:t>
         </w:r>

</xml_diff>

<commit_message>
Present business design and game guide cases with multilingual evidence
</commit_message>
<xml_diff>
--- a/assets/resumes/yo-tenra-en-experience.docx
+++ b/assets/resumes/yo-tenra-en-experience.docx
@@ -190,9 +190,6 @@
       </w:r>
     </w:p>
     <w:p>
-      <w:pPr>
-        <w:keepNext/>
-      </w:pPr>
       <w:r>
         <w:rPr>
           <w:b/>
@@ -206,27 +203,7 @@
       </w:pPr>
       <w:r>
         <w:rPr/>
-        <w:t xml:space="preserve">Founded and ran an in-game item and currency trading and consulting business, generating approximately </w:t>
-      </w:r>
-      <w:r>
-        <w:rPr>
-          <w:b/>
-        </w:rPr>
-        <w:t>CNY 15 million in cumulative revenue</w:t>
-      </w:r>
-      <w:r>
-        <w:rPr/>
-        <w:t xml:space="preserve"> and serving </w:t>
-      </w:r>
-      <w:r>
-        <w:rPr>
-          <w:b/>
-        </w:rPr>
-        <w:t>2,000+ unique customers</w:t>
-      </w:r>
-      <w:r>
-        <w:rPr/>
-        <w:t>.</w:t>
+        <w:t>Combined Chinese-language game content, reaching approximately 500,000 cumulative video views, with payment assistance, transaction handling, and game support for more than 2,000 unique customers.</w:t>
       </w:r>
     </w:p>
     <w:p>
@@ -235,7 +212,25 @@
       </w:pPr>
       <w:r>
         <w:rPr/>
-        <w:t>Produced videos and guides explaining game events, costs, and potential returns to help customers compare options; documented service procedures and organized customer-support responsibilities and follow-up.</w:t>
+        <w:t>Handled approximately CNY 15 million in cumulative customer payments, including top-ups, and generated more than CNY 3 million in gross profit after gift-card and top-up fulfilment costs, before wages and other operating costs.</w:t>
+      </w:r>
+    </w:p>
+    <w:p>
+      <w:pPr>
+        <w:pStyle w:val="ListBullet"/>
+      </w:pPr>
+      <w:r>
+        <w:rPr/>
+        <w:t>Estimated cumulative net profit was approximately CNY 2.5 million; peak staffing included approximately three interns.</w:t>
+      </w:r>
+    </w:p>
+    <w:p>
+      <w:pPr>
+        <w:pStyle w:val="ListBullet"/>
+      </w:pPr>
+      <w:r>
+        <w:rPr/>
+        <w:t>Contributed to Chinese-language guide graphics, built a guide website, and used expected-value calculations and comparisons of item costs and rewards to recommend event participation and spending plans; delivered version updates through PDFs, structured notes, videos, and subscriber messages.</w:t>
       </w:r>
     </w:p>
     <w:p>
@@ -244,13 +239,10 @@
       </w:pPr>
       <w:r>
         <w:rPr/>
-        <w:t>Holly Travel Int. Travel Agency — Assistant to the General Manager</w:t>
+        <w:t>Holly Travel Int. Travel Agency — Assistant to the CEO (Business Systems &amp; Development Coordination)</w:t>
       </w:r>
     </w:p>
     <w:p>
-      <w:pPr>
-        <w:keepNext/>
-      </w:pPr>
       <w:r>
         <w:rPr>
           <w:b/>
@@ -264,7 +256,7 @@
       </w:pPr>
       <w:r>
         <w:rPr/>
-        <w:t>Gathered finance and business requirements and wrote specifications for three modules covering supplier/distributor APIs and inventory, dynamic pricing and inventory, and employee performance.</w:t>
+        <w:t>Directly supported the CEO and coordinated business requirements with approximately 5–10 developers across hotel pricing, distribution, finance and accounting, and performance-based bonus systems.</w:t>
       </w:r>
     </w:p>
     <w:p>
@@ -273,13 +265,21 @@
       </w:pPr>
       <w:r>
         <w:rPr/>
-        <w:t>Worked with developers on technical options and schedules; followed through on testing, revisions, staff training, and user feedback. Also supported overseas business coordination, recruitment, and onboarding.</w:t>
+        <w:t>Observed sales pricing workflows, gathered requirements, and reconciled business usability with technical feasibility through a UI proposal, a demo, and requirements documents.</w:t>
+      </w:r>
+    </w:p>
+    <w:p>
+      <w:pPr>
+        <w:pStyle w:val="ListBullet"/>
+      </w:pPr>
+      <w:r>
+        <w:rPr/>
+        <w:t>Managed delivery progress using Gantt charts, dependencies, effort, costs, and staff availability; clarified blockers and compared implementation options against the same business goal.</w:t>
       </w:r>
     </w:p>
     <w:p>
       <w:pPr>
         <w:pStyle w:val="Heading1"/>
-        <w:pageBreakBefore/>
       </w:pPr>
       <w:r>
         <w:rPr/>
@@ -1011,7 +1011,7 @@
     <w:rsid w:val="00FC693F"/>
     <w:pPr>
       <w:widowControl/>
-      <w:spacing w:after="60" w:line="259" w:lineRule="auto"/>
+      <w:spacing w:after="20" w:line="245" w:lineRule="auto"/>
     </w:pPr>
     <w:rPr>
       <w:rFonts w:ascii="Times New Roman" w:hAnsi="Times New Roman" w:eastAsia="Noto Serif CJK JP" w:cs="Times New Roman"/>
@@ -1074,7 +1074,7 @@
     <w:pPr>
       <w:keepNext/>
       <w:keepLines/>
-      <w:spacing w:before="160" w:after="80"/>
+      <w:spacing w:before="100" w:after="80"/>
       <w:outlineLvl w:val="0"/>
     </w:pPr>
     <w:rPr>
@@ -1098,7 +1098,7 @@
     <w:pPr>
       <w:keepNext/>
       <w:keepLines/>
-      <w:spacing w:before="120" w:after="60"/>
+      <w:spacing w:before="80" w:after="60"/>
       <w:outlineLvl w:val="1"/>
     </w:pPr>
     <w:rPr>
@@ -1545,7 +1545,7 @@
       <w:numPr>
         <w:numId w:val="1"/>
       </w:numPr>
-      <w:spacing w:after="60" w:line="259" w:lineRule="auto"/>
+      <w:spacing w:after="20" w:line="245" w:lineRule="auto"/>
       <w:ind w:left="227" w:hanging="170"/>
       <w:contextualSpacing/>
     </w:pPr>

</xml_diff>